<commit_message>
T-13.2 + T-13.3: CI is green; make the manuscript's claim true
T-13.2: run 31350735475 on 91fe97c -- conclusion success, all three
matrix jobs green (test 3.10/3.11/3.12), exactly the acceptance
criterion. Closes the last open question SPIKE-13.1/ADR-0008 left.

T-13.3: replaced the "CI has never run" caveats in the manuscript and
README with the true statement -- enforced locally and in GitHub Actions
on every push -- each keeping a dated note of when the caveat stood and
a pointer to ADR-0008, per the project's no-silent-edits convention.
Docx rebuilt to match.

HANDOFF.md rewritten for the next batch: T-13.4, T-2.9, T-12.1, T-12.4,
T-12.6 at Sonnet, then the single remaining Opus task (T-12.5), then
T-12.7/T-12.8 back at Sonnet.

Co-Authored-By: Claude Sonnet 5 <noreply@anthropic.com>
</commit_message>
<xml_diff>
--- a/docs/paper/nature-draft.docx
+++ b/docs/paper/nature-draft.docx
@@ -15253,60 +15253,105 @@
         <w:t xml:space="preserve"> </w:t>
       </w:r>
       <w:r>
-        <w:t xml:space="preserve">⚠️</w:t>
-      </w:r>
-      <w:r>
-        <w:t xml:space="preserve"> </w:t>
-      </w:r>
-      <w:r>
-        <w:rPr>
-          <w:b/>
-          <w:bCs/>
-        </w:rPr>
-        <w:t xml:space="preserve">Stated precisely, because the repository’s CI has never run</w:t>
-      </w:r>
-      <w:r>
-        <w:t xml:space="preserve"> </w:t>
-      </w:r>
-      <w:r>
-        <w:t xml:space="preserve">(BACKLOG T-2.9): the check below is a real, enforcing gate — it is one of five that must pass</w:t>
-      </w:r>
-      <w:r>
-        <w:t xml:space="preserve"> </w:t>
-      </w:r>
-      <w:r>
-        <w:t xml:space="preserve">before any commit, and it has run on every commit in this project’s history — but it has run</w:t>
-      </w:r>
-      <w:r>
-        <w:t xml:space="preserve"> </w:t>
-      </w:r>
-      <w:r>
-        <w:rPr>
-          <w:b/>
-          <w:bCs/>
-        </w:rPr>
-        <w:t xml:space="preserve">locally</w:t>
-      </w:r>
-      <w:r>
-        <w:t xml:space="preserve">, not in GitHub Actions. Calling it</w:t>
-      </w:r>
-      <w:r>
-        <w:t xml:space="preserve"> </w:t>
-      </w:r>
-      <w:r>
+        <w:t xml:space="preserve">The check below is one of five gates that must pass before any commit —</w:t>
+      </w:r>
+      <w:r>
+        <w:t xml:space="preserve"> </w:t>
+      </w:r>
+      <w:r>
+        <w:t xml:space="preserve">enforced locally on every commit in this project’s history, and in GitHub Actions on every</w:t>
+      </w:r>
+      <w:r>
+        <w:t xml:space="preserve"> </w:t>
+      </w:r>
+      <w:r>
+        <w:t xml:space="preserve">push (three-version Python matrix; first green run:</w:t>
+      </w:r>
+      <w:r>
+        <w:t xml:space="preserve"> </w:t>
+      </w:r>
+      <w:r>
+        <w:t xml:space="preserve">https://github.com/sudo-install-gravity/tractor-beam-cathedral/actions/runs/31350735475).</w:t>
+      </w:r>
+      <w:r>
+        <w:t xml:space="preserve"> </w:t>
+      </w:r>
+      <w:r>
+        <w:rPr>
+          <w:i/>
+          <w:iCs/>
+        </w:rPr>
+        <w:t xml:space="preserve">A caveat stood here from 2026-08-06 to 2026-08-10, while the repository’s remote CI had</w:t>
+      </w:r>
+      <w:r>
+        <w:rPr>
+          <w:i/>
+          <w:iCs/>
+        </w:rPr>
+        <w:t xml:space="preserve"> </w:t>
+      </w:r>
+      <w:r>
+        <w:rPr>
+          <w:i/>
+          <w:iCs/>
+        </w:rPr>
+        <w:t xml:space="preserve">never run and calling the gate</w:t>
+      </w:r>
+      <w:r>
+        <w:rPr>
+          <w:i/>
+          <w:iCs/>
+        </w:rPr>
+        <w:t xml:space="preserve"> </w:t>
+      </w:r>
+      <w:r>
+        <w:rPr>
+          <w:i/>
+          <w:iCs/>
+        </w:rPr>
         <w:t xml:space="preserve">“continuous integration”</w:t>
       </w:r>
       <w:r>
-        <w:t xml:space="preserve"> </w:t>
-      </w:r>
-      <w:r>
-        <w:t xml:space="preserve">overstates where the</w:t>
-      </w:r>
-      <w:r>
-        <w:t xml:space="preserve"> </w:t>
-      </w:r>
-      <w:r>
-        <w:t xml:space="preserve">enforcement happens, and that wording is flagged for correction rather than left standing.</w:t>
+        <w:rPr>
+          <w:i/>
+          <w:iCs/>
+        </w:rPr>
+        <w:t xml:space="preserve"> </w:t>
+      </w:r>
+      <w:r>
+        <w:rPr>
+          <w:i/>
+          <w:iCs/>
+        </w:rPr>
+        <w:t xml:space="preserve">would have overstated where</w:t>
+      </w:r>
+      <w:r>
+        <w:rPr>
+          <w:i/>
+          <w:iCs/>
+        </w:rPr>
+        <w:t xml:space="preserve"> </w:t>
+      </w:r>
+      <w:r>
+        <w:rPr>
+          <w:i/>
+          <w:iCs/>
+        </w:rPr>
+        <w:t xml:space="preserve">enforcement happened; the cause — GitHub Actions disabled behind a UI-only control while</w:t>
+      </w:r>
+      <w:r>
+        <w:rPr>
+          <w:i/>
+          <w:iCs/>
+        </w:rPr>
+        <w:t xml:space="preserve"> </w:t>
+      </w:r>
+      <w:r>
+        <w:rPr>
+          <w:i/>
+          <w:iCs/>
+        </w:rPr>
+        <w:t xml:space="preserve">the API reported them enabled — and its resolution are recorded in ADR-0008.</w:t>
       </w:r>
     </w:p>
     <w:p>

</xml_diff>